<commit_message>
docs(dispensa): allineamento con slide — quote Schneier + esempio Fail Secure
Aggiunte alla dispensa per allinearla alle slide:

1. Quote di Bruce Schneier nella sezione 1.3 ("Cosa significa essere
   sicuri"). Già presente nelle slide L1 (slide 6), ora anche nella
   dispensa con paragrafo di accompagnamento sulla 'sicurezza come
   proprietà del sistema'.

2. Esempio di codice Fail Open vs Fail Secure nella sezione 1.6
   (I 5 principi). Già presente nelle slide L1 (slide 10 e 11), ora
   anche nella dispensa con due code block Python + spiegazione del
   pattern e callout finale.

File aggiornati:
- dispensa_completa.md (sorgente markdown)
- dispensa_completa.docx (rigenerata da pandoc)
- dispensa_completa_v2.docx (rigenerata da python-docx)
- docx/dispensa_completa.docx + docx/dispensa_completa_v2.docx (copie)
- generate_dispensa.py (script aggiornato)

Risultato: 100% coerenza slide ↔ dispensa.

Co-Authored-By: Claude Opus 4.7 <noreply@anthropic.com>
</commit_message>
<xml_diff>
--- a/dispensa_completa.docx
+++ b/dispensa_completa.docx
@@ -3124,7 +3124,93 @@
     </w:p>
     <w:p>
       <w:pPr>
+        <w:pStyle w:val="BlockText"/>
+      </w:pPr>
+      <w:r>
+        <w:rPr>
+          <w:i/>
+          <w:iCs/>
+        </w:rPr>
+        <w:t xml:space="preserve">“La sicurezza non è una feature: è una proprietà del sistema.”</w:t>
+      </w:r>
+      <w:r>
+        <w:t xml:space="preserve"> </w:t>
+      </w:r>
+      <w:r>
+        <w:t xml:space="preserve">—</w:t>
+      </w:r>
+      <w:r>
+        <w:t xml:space="preserve"> </w:t>
+      </w:r>
+      <w:r>
+        <w:rPr>
+          <w:b/>
+          <w:bCs/>
+        </w:rPr>
+        <w:t xml:space="preserve">Bruce Schneier</w:t>
+      </w:r>
+    </w:p>
+    <w:p>
+      <w:pPr>
         <w:pStyle w:val="FirstParagraph"/>
+      </w:pPr>
+      <w:r>
+        <w:t xml:space="preserve">Tieniti questa frase. È il riassunto in una riga di tutto il corso. La sicurezza non è qualcosa che</w:t>
+      </w:r>
+      <w:r>
+        <w:t xml:space="preserve"> </w:t>
+      </w:r>
+      <w:r>
+        <w:t xml:space="preserve">“aggiungi”</w:t>
+      </w:r>
+      <w:r>
+        <w:t xml:space="preserve"> </w:t>
+      </w:r>
+      <w:r>
+        <w:t xml:space="preserve">alla fine, come una funzionalità in più (es.</w:t>
+      </w:r>
+      <w:r>
+        <w:t xml:space="preserve"> </w:t>
+      </w:r>
+      <w:r>
+        <w:t xml:space="preserve">“ah, mettiamo anche il login”</w:t>
+      </w:r>
+      <w:r>
+        <w:t xml:space="preserve">); è una</w:t>
+      </w:r>
+      <w:r>
+        <w:t xml:space="preserve"> </w:t>
+      </w:r>
+      <w:r>
+        <w:rPr>
+          <w:b/>
+          <w:bCs/>
+        </w:rPr>
+        <w:t xml:space="preserve">proprietà</w:t>
+      </w:r>
+      <w:r>
+        <w:t xml:space="preserve"> </w:t>
+      </w:r>
+      <w:r>
+        <w:t xml:space="preserve">che il sistema possiede o non possiede, e che si decide al momento del</w:t>
+      </w:r>
+      <w:r>
+        <w:t xml:space="preserve"> </w:t>
+      </w:r>
+      <w:r>
+        <w:rPr>
+          <w:b/>
+          <w:bCs/>
+        </w:rPr>
+        <w:t xml:space="preserve">design</w:t>
+      </w:r>
+      <w:r>
+        <w:t xml:space="preserve">.</w:t>
+      </w:r>
+    </w:p>
+    <w:p>
+      <w:pPr>
+        <w:pStyle w:val="BodyText"/>
       </w:pPr>
       <w:r>
         <w:t xml:space="preserve">In informatica,</w:t>
@@ -4231,22 +4317,457 @@
         <w:t xml:space="preserve"> </w:t>
       </w:r>
       <w:r>
-        <w:t xml:space="preserve">deve passare. Vedremo nel Cap 4 un esempio in cui un</w:t>
-      </w:r>
-      <w:r>
-        <w:t xml:space="preserve"> </w:t>
-      </w:r>
-      <w:r>
-        <w:rPr>
-          <w:rStyle w:val="VerbatimChar"/>
-        </w:rPr>
-        <w:t xml:space="preserve">try/except</w:t>
-      </w:r>
-      <w:r>
-        <w:t xml:space="preserve"> </w:t>
-      </w:r>
-      <w:r>
-        <w:t xml:space="preserve">mal scritto trasforma un controllo di sicurezza in un colabrodo.</w:t>
+        <w:t xml:space="preserve">deve passare.</w:t>
+      </w:r>
+    </w:p>
+    <w:p>
+      <w:pPr>
+        <w:pStyle w:val="BodyText"/>
+      </w:pPr>
+      <w:r>
+        <w:t xml:space="preserve">Esempio di</w:t>
+      </w:r>
+      <w:r>
+        <w:t xml:space="preserve"> </w:t>
+      </w:r>
+      <w:r>
+        <w:rPr>
+          <w:b/>
+          <w:bCs/>
+        </w:rPr>
+        <w:t xml:space="preserve">codice che fallisce in modo aperto</w:t>
+      </w:r>
+      <w:r>
+        <w:t xml:space="preserve"> </w:t>
+      </w:r>
+      <w:r>
+        <w:t xml:space="preserve">(anti-pattern):</w:t>
+      </w:r>
+    </w:p>
+    <w:p>
+      <w:pPr>
+        <w:pStyle w:val="SourceCode"/>
+      </w:pPr>
+      <w:r>
+        <w:rPr>
+          <w:rStyle w:val="CommentTok"/>
+        </w:rPr>
+        <w:t xml:space="preserve"># 🚩 FAIL OPEN — se il check si rompe, l'utente entra LO STESSO</w:t>
+      </w:r>
+      <w:r>
+        <w:br/>
+      </w:r>
+      <w:r>
+        <w:rPr>
+          <w:rStyle w:val="ControlFlowTok"/>
+        </w:rPr>
+        <w:t xml:space="preserve">try</w:t>
+      </w:r>
+      <w:r>
+        <w:rPr>
+          <w:rStyle w:val="NormalTok"/>
+        </w:rPr>
+        <w:t xml:space="preserve">:</w:t>
+      </w:r>
+      <w:r>
+        <w:br/>
+      </w:r>
+      <w:r>
+        <w:rPr>
+          <w:rStyle w:val="NormalTok"/>
+        </w:rPr>
+        <w:t xml:space="preserve">    </w:t>
+      </w:r>
+      <w:r>
+        <w:rPr>
+          <w:rStyle w:val="ControlFlowTok"/>
+        </w:rPr>
+        <w:t xml:space="preserve">if</w:t>
+      </w:r>
+      <w:r>
+        <w:rPr>
+          <w:rStyle w:val="NormalTok"/>
+        </w:rPr>
+        <w:t xml:space="preserve"> </w:t>
+      </w:r>
+      <w:r>
+        <w:rPr>
+          <w:rStyle w:val="KeywordTok"/>
+        </w:rPr>
+        <w:t xml:space="preserve">not</w:t>
+      </w:r>
+      <w:r>
+        <w:rPr>
+          <w:rStyle w:val="NormalTok"/>
+        </w:rPr>
+        <w:t xml:space="preserve"> is_authorized(user, resource):</w:t>
+      </w:r>
+      <w:r>
+        <w:br/>
+      </w:r>
+      <w:r>
+        <w:rPr>
+          <w:rStyle w:val="NormalTok"/>
+        </w:rPr>
+        <w:t xml:space="preserve">        </w:t>
+      </w:r>
+      <w:r>
+        <w:rPr>
+          <w:rStyle w:val="ControlFlowTok"/>
+        </w:rPr>
+        <w:t xml:space="preserve">return</w:t>
+      </w:r>
+      <w:r>
+        <w:rPr>
+          <w:rStyle w:val="NormalTok"/>
+        </w:rPr>
+        <w:t xml:space="preserve"> </w:t>
+      </w:r>
+      <w:r>
+        <w:rPr>
+          <w:rStyle w:val="DecValTok"/>
+        </w:rPr>
+        <w:t xml:space="preserve">403</w:t>
+      </w:r>
+      <w:r>
+        <w:br/>
+      </w:r>
+      <w:r>
+        <w:rPr>
+          <w:rStyle w:val="NormalTok"/>
+        </w:rPr>
+        <w:t xml:space="preserve">    </w:t>
+      </w:r>
+      <w:r>
+        <w:rPr>
+          <w:rStyle w:val="ControlFlowTok"/>
+        </w:rPr>
+        <w:t xml:space="preserve">return</w:t>
+      </w:r>
+      <w:r>
+        <w:rPr>
+          <w:rStyle w:val="NormalTok"/>
+        </w:rPr>
+        <w:t xml:space="preserve"> resource</w:t>
+      </w:r>
+      <w:r>
+        <w:br/>
+      </w:r>
+      <w:r>
+        <w:rPr>
+          <w:rStyle w:val="ControlFlowTok"/>
+        </w:rPr>
+        <w:t xml:space="preserve">except</w:t>
+      </w:r>
+      <w:r>
+        <w:rPr>
+          <w:rStyle w:val="NormalTok"/>
+        </w:rPr>
+        <w:t xml:space="preserve"> </w:t>
+      </w:r>
+      <w:r>
+        <w:rPr>
+          <w:rStyle w:val="PreprocessorTok"/>
+        </w:rPr>
+        <w:t xml:space="preserve">Exception</w:t>
+      </w:r>
+      <w:r>
+        <w:rPr>
+          <w:rStyle w:val="NormalTok"/>
+        </w:rPr>
+        <w:t xml:space="preserve">:</w:t>
+      </w:r>
+      <w:r>
+        <w:br/>
+      </w:r>
+      <w:r>
+        <w:rPr>
+          <w:rStyle w:val="NormalTok"/>
+        </w:rPr>
+        <w:t xml:space="preserve">    </w:t>
+      </w:r>
+      <w:r>
+        <w:rPr>
+          <w:rStyle w:val="ControlFlowTok"/>
+        </w:rPr>
+        <w:t xml:space="preserve">return</w:t>
+      </w:r>
+      <w:r>
+        <w:rPr>
+          <w:rStyle w:val="NormalTok"/>
+        </w:rPr>
+        <w:t xml:space="preserve"> resource   </w:t>
+      </w:r>
+      <w:r>
+        <w:rPr>
+          <w:rStyle w:val="CommentTok"/>
+        </w:rPr>
+        <w:t xml:space="preserve"># 💥 disastro silenzioso</w:t>
+      </w:r>
+    </w:p>
+    <w:p>
+      <w:pPr>
+        <w:pStyle w:val="FirstParagraph"/>
+      </w:pPr>
+      <w:r>
+        <w:t xml:space="preserve">Sembra</w:t>
+      </w:r>
+      <w:r>
+        <w:t xml:space="preserve"> </w:t>
+      </w:r>
+      <w:r>
+        <w:t xml:space="preserve">“robusto”</w:t>
+      </w:r>
+      <w:r>
+        <w:t xml:space="preserve"> </w:t>
+      </w:r>
+      <w:r>
+        <w:t xml:space="preserve">perché cattura ogni errore, ma è esattamente il contrario: trasforma un controllo di sicurezza in un colabrodo. Versione corretta:</w:t>
+      </w:r>
+    </w:p>
+    <w:p>
+      <w:pPr>
+        <w:pStyle w:val="SourceCode"/>
+      </w:pPr>
+      <w:r>
+        <w:rPr>
+          <w:rStyle w:val="CommentTok"/>
+        </w:rPr>
+        <w:t xml:space="preserve"># ✅ FAIL SECURE — se il check si rompe, il sistema CHIUDE</w:t>
+      </w:r>
+      <w:r>
+        <w:br/>
+      </w:r>
+      <w:r>
+        <w:rPr>
+          <w:rStyle w:val="ControlFlowTok"/>
+        </w:rPr>
+        <w:t xml:space="preserve">try</w:t>
+      </w:r>
+      <w:r>
+        <w:rPr>
+          <w:rStyle w:val="NormalTok"/>
+        </w:rPr>
+        <w:t xml:space="preserve">:</w:t>
+      </w:r>
+      <w:r>
+        <w:br/>
+      </w:r>
+      <w:r>
+        <w:rPr>
+          <w:rStyle w:val="NormalTok"/>
+        </w:rPr>
+        <w:t xml:space="preserve">    </w:t>
+      </w:r>
+      <w:r>
+        <w:rPr>
+          <w:rStyle w:val="ControlFlowTok"/>
+        </w:rPr>
+        <w:t xml:space="preserve">if</w:t>
+      </w:r>
+      <w:r>
+        <w:rPr>
+          <w:rStyle w:val="NormalTok"/>
+        </w:rPr>
+        <w:t xml:space="preserve"> </w:t>
+      </w:r>
+      <w:r>
+        <w:rPr>
+          <w:rStyle w:val="KeywordTok"/>
+        </w:rPr>
+        <w:t xml:space="preserve">not</w:t>
+      </w:r>
+      <w:r>
+        <w:rPr>
+          <w:rStyle w:val="NormalTok"/>
+        </w:rPr>
+        <w:t xml:space="preserve"> is_authorized(user, resource):</w:t>
+      </w:r>
+      <w:r>
+        <w:br/>
+      </w:r>
+      <w:r>
+        <w:rPr>
+          <w:rStyle w:val="NormalTok"/>
+        </w:rPr>
+        <w:t xml:space="preserve">        </w:t>
+      </w:r>
+      <w:r>
+        <w:rPr>
+          <w:rStyle w:val="ControlFlowTok"/>
+        </w:rPr>
+        <w:t xml:space="preserve">return</w:t>
+      </w:r>
+      <w:r>
+        <w:rPr>
+          <w:rStyle w:val="NormalTok"/>
+        </w:rPr>
+        <w:t xml:space="preserve"> </w:t>
+      </w:r>
+      <w:r>
+        <w:rPr>
+          <w:rStyle w:val="DecValTok"/>
+        </w:rPr>
+        <w:t xml:space="preserve">403</w:t>
+      </w:r>
+      <w:r>
+        <w:br/>
+      </w:r>
+      <w:r>
+        <w:rPr>
+          <w:rStyle w:val="NormalTok"/>
+        </w:rPr>
+        <w:t xml:space="preserve">    </w:t>
+      </w:r>
+      <w:r>
+        <w:rPr>
+          <w:rStyle w:val="ControlFlowTok"/>
+        </w:rPr>
+        <w:t xml:space="preserve">return</w:t>
+      </w:r>
+      <w:r>
+        <w:rPr>
+          <w:rStyle w:val="NormalTok"/>
+        </w:rPr>
+        <w:t xml:space="preserve"> resource</w:t>
+      </w:r>
+      <w:r>
+        <w:br/>
+      </w:r>
+      <w:r>
+        <w:rPr>
+          <w:rStyle w:val="ControlFlowTok"/>
+        </w:rPr>
+        <w:t xml:space="preserve">except</w:t>
+      </w:r>
+      <w:r>
+        <w:rPr>
+          <w:rStyle w:val="NormalTok"/>
+        </w:rPr>
+        <w:t xml:space="preserve"> </w:t>
+      </w:r>
+      <w:r>
+        <w:rPr>
+          <w:rStyle w:val="PreprocessorTok"/>
+        </w:rPr>
+        <w:t xml:space="preserve">Exception</w:t>
+      </w:r>
+      <w:r>
+        <w:rPr>
+          <w:rStyle w:val="NormalTok"/>
+        </w:rPr>
+        <w:t xml:space="preserve"> </w:t>
+      </w:r>
+      <w:r>
+        <w:rPr>
+          <w:rStyle w:val="ImportTok"/>
+        </w:rPr>
+        <w:t xml:space="preserve">as</w:t>
+      </w:r>
+      <w:r>
+        <w:rPr>
+          <w:rStyle w:val="NormalTok"/>
+        </w:rPr>
+        <w:t xml:space="preserve"> e:</w:t>
+      </w:r>
+      <w:r>
+        <w:br/>
+      </w:r>
+      <w:r>
+        <w:rPr>
+          <w:rStyle w:val="NormalTok"/>
+        </w:rPr>
+        <w:t xml:space="preserve">    log.exception(</w:t>
+      </w:r>
+      <w:r>
+        <w:rPr>
+          <w:rStyle w:val="StringTok"/>
+        </w:rPr>
+        <w:t xml:space="preserve">"auth check failed"</w:t>
+      </w:r>
+      <w:r>
+        <w:rPr>
+          <w:rStyle w:val="NormalTok"/>
+        </w:rPr>
+        <w:t xml:space="preserve">)</w:t>
+      </w:r>
+      <w:r>
+        <w:br/>
+      </w:r>
+      <w:r>
+        <w:rPr>
+          <w:rStyle w:val="NormalTok"/>
+        </w:rPr>
+        <w:t xml:space="preserve">    </w:t>
+      </w:r>
+      <w:r>
+        <w:rPr>
+          <w:rStyle w:val="ControlFlowTok"/>
+        </w:rPr>
+        <w:t xml:space="preserve">return</w:t>
+      </w:r>
+      <w:r>
+        <w:rPr>
+          <w:rStyle w:val="NormalTok"/>
+        </w:rPr>
+        <w:t xml:space="preserve"> </w:t>
+      </w:r>
+      <w:r>
+        <w:rPr>
+          <w:rStyle w:val="DecValTok"/>
+        </w:rPr>
+        <w:t xml:space="preserve">503</w:t>
+      </w:r>
+      <w:r>
+        <w:rPr>
+          <w:rStyle w:val="NormalTok"/>
+        </w:rPr>
+        <w:t xml:space="preserve">   </w:t>
+      </w:r>
+      <w:r>
+        <w:rPr>
+          <w:rStyle w:val="CommentTok"/>
+        </w:rPr>
+        <w:t xml:space="preserve"># servizio non disponibile, NON accesso senza autorizzazione</w:t>
+      </w:r>
+    </w:p>
+    <w:p>
+      <w:pPr>
+        <w:pStyle w:val="FirstParagraph"/>
+      </w:pPr>
+      <w:r>
+        <w:t xml:space="preserve">In dubbio, il sistema</w:t>
+      </w:r>
+      <w:r>
+        <w:t xml:space="preserve"> </w:t>
+      </w:r>
+      <w:r>
+        <w:rPr>
+          <w:b/>
+          <w:bCs/>
+        </w:rPr>
+        <w:t xml:space="preserve">chiude</w:t>
+      </w:r>
+      <w:r>
+        <w:t xml:space="preserve">, non apre. Vale per autorizzazione, autenticazione, validazione, decisioni critiche di business: il default è sempre</w:t>
+      </w:r>
+      <w:r>
+        <w:t xml:space="preserve"> </w:t>
+      </w:r>
+      <w:r>
+        <w:t xml:space="preserve">“nega + segnala”</w:t>
+      </w:r>
+      <w:r>
+        <w:t xml:space="preserve">, mai</w:t>
+      </w:r>
+      <w:r>
+        <w:t xml:space="preserve"> </w:t>
+      </w:r>
+      <w:r>
+        <w:t xml:space="preserve">“permetti silenziosamente”</w:t>
+      </w:r>
+      <w:r>
+        <w:t xml:space="preserve">.</w:t>
       </w:r>
     </w:p>
     <w:p>

</xml_diff>